<commit_message>
Fix figure extraction pipeline to preserve all distinct images with unique filenames and fix multi-author multi-affiliation structural mapping for LaTeX templates
</commit_message>
<xml_diff>
--- a/api/app/samples/sample_manuscript.docx
+++ b/api/app/samples/sample_manuscript.docx
@@ -12,12 +12,22 @@
     </w:p>
     <w:p>
       <w:r>
-        <w:t>Dr. Jane Doe, Professor of Computer Science</w:t>
+        <w:t>Alice Smith1, Bob Jones1,2, Charlie Brown2</w:t>
       </w:r>
     </w:p>
     <w:p>
       <w:r>
-        <w:t>Abstract: Academic document conversion requires semantic structure preservation.</w:t>
+        <w:t>1 Department of Computer Science, Stanford University, CA, USA</w:t>
+      </w:r>
+    </w:p>
+    <w:p>
+      <w:r>
+        <w:t>2 Department of Electrical Engineering, MIT, MA, USA</w:t>
+      </w:r>
+    </w:p>
+    <w:p>
+      <w:r>
+        <w:t>Abstract: Academic document conversion requires semantic structure and multi-figure preservation.</w:t>
       </w:r>
     </w:p>
     <w:p>
@@ -34,6 +44,52 @@
       </w:r>
     </w:p>
     <w:p>
+      <w:r>
+        <w:t>Overview of system design is depicted below.</w:t>
+      </w:r>
+    </w:p>
+    <w:p>
+      <w:r>
+        <w:drawing>
+          <wp:inline xmlns:a="http://schemas.openxmlformats.org/drawingml/2006/main" xmlns:pic="http://schemas.openxmlformats.org/drawingml/2006/picture">
+            <wp:extent cx="2743200" cy="1175657"/>
+            <wp:docPr id="1" name="Picture 1"/>
+            <wp:cNvGraphicFramePr>
+              <a:graphicFrameLocks noChangeAspect="1"/>
+            </wp:cNvGraphicFramePr>
+            <a:graphic>
+              <a:graphicData uri="http://schemas.openxmlformats.org/drawingml/2006/picture">
+                <pic:pic>
+                  <pic:nvPicPr>
+                    <pic:cNvPr id="0" name="tmp_sample_fig1.png"/>
+                    <pic:cNvPicPr/>
+                  </pic:nvPicPr>
+                  <pic:blipFill>
+                    <a:blip r:embed="rId9"/>
+                    <a:stretch>
+                      <a:fillRect/>
+                    </a:stretch>
+                  </pic:blipFill>
+                  <pic:spPr>
+                    <a:xfrm>
+                      <a:off x="0" y="0"/>
+                      <a:ext cx="2743200" cy="1175657"/>
+                    </a:xfrm>
+                    <a:prstGeom prst="rect"/>
+                  </pic:spPr>
+                </pic:pic>
+              </a:graphicData>
+            </a:graphic>
+          </wp:inline>
+        </w:drawing>
+      </w:r>
+    </w:p>
+    <w:p>
+      <w:r>
+        <w:t>Figure 1: Architecture Pipeline Diagram</w:t>
+      </w:r>
+    </w:p>
+    <w:p>
       <w:pPr>
         <w:pStyle w:val="Heading1"/>
       </w:pPr>
@@ -43,7 +99,102 @@
     </w:p>
     <w:p>
       <w:r>
-        <w:t>The parser extracts sections, tables, and references.</w:t>
+        <w:t>The parser extracts sections, tables, and figures.</w:t>
+      </w:r>
+    </w:p>
+    <w:p>
+      <w:r>
+        <w:drawing>
+          <wp:inline xmlns:a="http://schemas.openxmlformats.org/drawingml/2006/main" xmlns:pic="http://schemas.openxmlformats.org/drawingml/2006/picture">
+            <wp:extent cx="2743200" cy="1175657"/>
+            <wp:docPr id="2" name="Picture 2"/>
+            <wp:cNvGraphicFramePr>
+              <a:graphicFrameLocks noChangeAspect="1"/>
+            </wp:cNvGraphicFramePr>
+            <a:graphic>
+              <a:graphicData uri="http://schemas.openxmlformats.org/drawingml/2006/picture">
+                <pic:pic>
+                  <pic:nvPicPr>
+                    <pic:cNvPr id="0" name="tmp_sample_fig2.png"/>
+                    <pic:cNvPicPr/>
+                  </pic:nvPicPr>
+                  <pic:blipFill>
+                    <a:blip r:embed="rId10"/>
+                    <a:stretch>
+                      <a:fillRect/>
+                    </a:stretch>
+                  </pic:blipFill>
+                  <pic:spPr>
+                    <a:xfrm>
+                      <a:off x="0" y="0"/>
+                      <a:ext cx="2743200" cy="1175657"/>
+                    </a:xfrm>
+                    <a:prstGeom prst="rect"/>
+                  </pic:spPr>
+                </pic:pic>
+              </a:graphicData>
+            </a:graphic>
+          </wp:inline>
+        </w:drawing>
+      </w:r>
+    </w:p>
+    <w:p>
+      <w:r>
+        <w:t>Figure 2: Data Flow Chart</w:t>
+      </w:r>
+    </w:p>
+    <w:p>
+      <w:pPr>
+        <w:pStyle w:val="Heading1"/>
+      </w:pPr>
+      <w:r>
+        <w:t>3. Experimental Evaluation</w:t>
+      </w:r>
+    </w:p>
+    <w:p>
+      <w:r>
+        <w:t>Performance across workflows is shown in Figure 3.</w:t>
+      </w:r>
+    </w:p>
+    <w:p>
+      <w:r>
+        <w:drawing>
+          <wp:inline xmlns:a="http://schemas.openxmlformats.org/drawingml/2006/main" xmlns:pic="http://schemas.openxmlformats.org/drawingml/2006/picture">
+            <wp:extent cx="2743200" cy="1175657"/>
+            <wp:docPr id="3" name="Picture 3"/>
+            <wp:cNvGraphicFramePr>
+              <a:graphicFrameLocks noChangeAspect="1"/>
+            </wp:cNvGraphicFramePr>
+            <a:graphic>
+              <a:graphicData uri="http://schemas.openxmlformats.org/drawingml/2006/picture">
+                <pic:pic>
+                  <pic:nvPicPr>
+                    <pic:cNvPr id="0" name="tmp_sample_fig3.png"/>
+                    <pic:cNvPicPr/>
+                  </pic:nvPicPr>
+                  <pic:blipFill>
+                    <a:blip r:embed="rId11"/>
+                    <a:stretch>
+                      <a:fillRect/>
+                    </a:stretch>
+                  </pic:blipFill>
+                  <pic:spPr>
+                    <a:xfrm>
+                      <a:off x="0" y="0"/>
+                      <a:ext cx="2743200" cy="1175657"/>
+                    </a:xfrm>
+                    <a:prstGeom prst="rect"/>
+                  </pic:spPr>
+                </pic:pic>
+              </a:graphicData>
+            </a:graphic>
+          </wp:inline>
+        </w:drawing>
+      </w:r>
+    </w:p>
+    <w:p>
+      <w:r>
+        <w:t>Figure 3: Experimental Results Graph</w:t>
       </w:r>
     </w:p>
     <w:tbl>
@@ -110,7 +261,7 @@
     </w:p>
     <w:p>
       <w:r>
-        <w:t>[1] Doe, J. Universal Document Compiler, 2024.</w:t>
+        <w:t>[1] Smith, A. Universal Document Compiler, 2024.</w:t>
       </w:r>
     </w:p>
     <w:sectPr>

</xml_diff>